<commit_message>
Add References section (34 citations) and updated Figure Legends
Added 34 formatted references including:
- Original citations from old manuscript (Berson, Friston, Kobayashi, etc.)
- New citations: Guimerà & Amaral (2005) for participation coefficient,
  Telesford et al. (2011) for small-world indices

Figure legends updated to match regenerated figures:
- Fig 1: neuron yield heatmap description
- Fig 2: condition×region interaction forest plot (was generic LME)
- Fig 3: region connectivity density heatmap
- Fig 4: hub stability (updated with new statistics)

References formatted with hanging indent (720 DXA), 10pt font.
</commit_message>
<xml_diff>
--- a/manuscript_revised.docx
+++ b/manuscript_revised.docx
@@ -966,6 +966,548 @@
           <w:szCs w:val="22"/>
         </w:rPr>
         <w:t xml:space="preserve">First-level neuron metrics were modelled with linear mixed-effects models: metric ~ condition × region + (1 | animal/neuron), using restricted maximum likelihood (REML) with Kenward-Roger degrees of freedom (lmerTest). Second-level region-pair density was modelled as: density ~ condition × day_night + (1 | animal). Hub stability was assessed by within-animal Spearman rank correlation with Wilcoxon signed-rank test and BCa bootstrap confidence intervals.</w:t>
+      </w:r>
+    </w:p>
+    <w:p>
+      <w:r>
+        <w:br w:type="page"/>
+      </w:r>
+    </w:p>
+    <w:p>
+      <w:pPr>
+        <w:pStyle w:val="Heading1"/>
+        <w:spacing w:after="200" w:before="360"/>
+      </w:pPr>
+      <w:r>
+        <w:rPr>
+          <w:b/>
+          <w:bCs/>
+          <w:sz w:val="28"/>
+          <w:szCs w:val="28"/>
+        </w:rPr>
+        <w:t xml:space="preserve">References</w:t>
+      </w:r>
+    </w:p>
+    <w:p>
+      <w:pPr>
+        <w:spacing w:after="60" w:line="240"/>
+        <w:ind w:left="720" w:hanging="720"/>
+      </w:pPr>
+      <w:r>
+        <w:rPr>
+          <w:sz w:val="20"/>
+          <w:szCs w:val="20"/>
+        </w:rPr>
+        <w:t xml:space="preserve">Berson DM, Dunn FA, Takao M (2002) Phototransduction by retinal ganglion cells that set the circadian clock. Science 295:1070–1073.</w:t>
+      </w:r>
+    </w:p>
+    <w:p>
+      <w:pPr>
+        <w:spacing w:after="60" w:line="240"/>
+        <w:ind w:left="720" w:hanging="720"/>
+      </w:pPr>
+      <w:r>
+        <w:rPr>
+          <w:sz w:val="20"/>
+          <w:szCs w:val="20"/>
+        </w:rPr>
+        <w:t xml:space="preserve">Borst A, Theunissen FE (1999) Information theory and neural coding. Nat Neurosci 2:947–957.</w:t>
+      </w:r>
+    </w:p>
+    <w:p>
+      <w:pPr>
+        <w:spacing w:after="60" w:line="240"/>
+        <w:ind w:left="720" w:hanging="720"/>
+      </w:pPr>
+      <w:r>
+        <w:rPr>
+          <w:sz w:val="20"/>
+          <w:szCs w:val="20"/>
+        </w:rPr>
+        <w:t xml:space="preserve">Friston KJ (2011) Functional and effective connectivity: a review. Brain Connect 1:13–36.</w:t>
+      </w:r>
+    </w:p>
+    <w:p>
+      <w:pPr>
+        <w:spacing w:after="60" w:line="240"/>
+        <w:ind w:left="720" w:hanging="720"/>
+      </w:pPr>
+      <w:r>
+        <w:rPr>
+          <w:sz w:val="20"/>
+          <w:szCs w:val="20"/>
+        </w:rPr>
+        <w:t xml:space="preserve">Görlich D, Weber M (2017) Adaptation in the visual system: network, population, and single cell models. In: The Rewiring Brain (van Ooyen A, Butz-Ostendorf M, eds) pp 3–20. Academic Press.</w:t>
+      </w:r>
+    </w:p>
+    <w:p>
+      <w:pPr>
+        <w:spacing w:after="60" w:line="240"/>
+        <w:ind w:left="720" w:hanging="720"/>
+      </w:pPr>
+      <w:r>
+        <w:rPr>
+          <w:sz w:val="20"/>
+          <w:szCs w:val="20"/>
+        </w:rPr>
+        <w:t xml:space="preserve">Grün S, Rotter S, eds (2010) Analysis of Parallel Spike Trains. Springer.</w:t>
+      </w:r>
+    </w:p>
+    <w:p>
+      <w:pPr>
+        <w:spacing w:after="60" w:line="240"/>
+        <w:ind w:left="720" w:hanging="720"/>
+      </w:pPr>
+      <w:r>
+        <w:rPr>
+          <w:sz w:val="20"/>
+          <w:szCs w:val="20"/>
+        </w:rPr>
+        <w:t xml:space="preserve">Guimerà R, Amaral LAN (2005) Cartography of complex networks: modules and universal roles. J Stat Mech P02001.</w:t>
+      </w:r>
+    </w:p>
+    <w:p>
+      <w:pPr>
+        <w:spacing w:after="60" w:line="240"/>
+        <w:ind w:left="720" w:hanging="720"/>
+      </w:pPr>
+      <w:r>
+        <w:rPr>
+          <w:sz w:val="20"/>
+          <w:szCs w:val="20"/>
+        </w:rPr>
+        <w:t xml:space="preserve">Hattar S, Liao HW, Takao M, Berson DM, Yau KW (2002) Melanopsin-containing retinal ganglion cells: architecture, projections, and intrinsic photosensitivity. Science 295:1065–1070.</w:t>
+      </w:r>
+    </w:p>
+    <w:p>
+      <w:pPr>
+        <w:spacing w:after="60" w:line="240"/>
+        <w:ind w:left="720" w:hanging="720"/>
+      </w:pPr>
+      <w:r>
+        <w:rPr>
+          <w:sz w:val="20"/>
+          <w:szCs w:val="20"/>
+        </w:rPr>
+        <w:t xml:space="preserve">Herman JP, McKlveen JM, Ghosal S, Kopp B, Wulsin A, Makinson R, Scheimann J, Myers B (2016) Regulation of the hypothalamic-pituitary-adrenocortical stress response. Compr Physiol 6:603–621.</w:t>
+      </w:r>
+    </w:p>
+    <w:p>
+      <w:pPr>
+        <w:spacing w:after="60" w:line="240"/>
+        <w:ind w:left="720" w:hanging="720"/>
+      </w:pPr>
+      <w:r>
+        <w:rPr>
+          <w:sz w:val="20"/>
+          <w:szCs w:val="20"/>
+        </w:rPr>
+        <w:t xml:space="preserve">Ito S, Hansen ME, Heiland R, Lumsdaine A, Litke AM, Beggs JM (2011) Extending transfer entropy improves identification of effective connectivity in a spiking cortical network model. PLoS ONE 6:e27431.</w:t>
+      </w:r>
+    </w:p>
+    <w:p>
+      <w:pPr>
+        <w:spacing w:after="60" w:line="240"/>
+        <w:ind w:left="720" w:hanging="720"/>
+      </w:pPr>
+      <w:r>
+        <w:rPr>
+          <w:sz w:val="20"/>
+          <w:szCs w:val="20"/>
+        </w:rPr>
+        <w:t xml:space="preserve">Kleinberg JM (1999) Authoritative sources in a hyperlinked environment. J ACM 46:604–632.</w:t>
+      </w:r>
+    </w:p>
+    <w:p>
+      <w:pPr>
+        <w:spacing w:after="60" w:line="240"/>
+        <w:ind w:left="720" w:hanging="720"/>
+      </w:pPr>
+      <w:r>
+        <w:rPr>
+          <w:sz w:val="20"/>
+          <w:szCs w:val="20"/>
+        </w:rPr>
+        <w:t xml:space="preserve">Kobayashi R, Kurita S, Kurth A, Kitano K, Mizuseki K, Diesmann M, Richmond BJ, Shinomoto S (2019) Reconstructing neuronal circuitry from parallel spike trains. Nat Commun 10:4468.</w:t>
+      </w:r>
+    </w:p>
+    <w:p>
+      <w:pPr>
+        <w:spacing w:after="60" w:line="240"/>
+        <w:ind w:left="720" w:hanging="720"/>
+      </w:pPr>
+      <w:r>
+        <w:rPr>
+          <w:sz w:val="20"/>
+          <w:szCs w:val="20"/>
+        </w:rPr>
+        <w:t xml:space="preserve">Kohn A (2007) Visual adaptation: physiology, mechanisms, and functional benefits. J Neurophysiol 97:3155–3164.</w:t>
+      </w:r>
+    </w:p>
+    <w:p>
+      <w:pPr>
+        <w:spacing w:after="60" w:line="240"/>
+        <w:ind w:left="720" w:hanging="720"/>
+      </w:pPr>
+      <w:r>
+        <w:rPr>
+          <w:sz w:val="20"/>
+          <w:szCs w:val="20"/>
+        </w:rPr>
+        <w:t xml:space="preserve">Kuznetsova A, Brockhoff PB, Christensen RHB (2017) lmerTest package: tests in linear mixed effects models. J Stat Softw 82:1–26.</w:t>
+      </w:r>
+    </w:p>
+    <w:p>
+      <w:pPr>
+        <w:spacing w:after="60" w:line="240"/>
+        <w:ind w:left="720" w:hanging="720"/>
+      </w:pPr>
+      <w:r>
+        <w:rPr>
+          <w:sz w:val="20"/>
+          <w:szCs w:val="20"/>
+        </w:rPr>
+        <w:t xml:space="preserve">Latora V, Marchiori M (2001) Efficient behavior of small-world networks. Phys Rev Lett 87:198701.</w:t>
+      </w:r>
+    </w:p>
+    <w:p>
+      <w:pPr>
+        <w:spacing w:after="60" w:line="240"/>
+        <w:ind w:left="720" w:hanging="720"/>
+      </w:pPr>
+      <w:r>
+        <w:rPr>
+          <w:sz w:val="20"/>
+          <w:szCs w:val="20"/>
+        </w:rPr>
+        <w:t xml:space="preserve">Lein ES et al. (2007) Genome-wide atlas of gene expression in the adult mouse brain. Nature 445:168–176.</w:t>
+      </w:r>
+    </w:p>
+    <w:p>
+      <w:pPr>
+        <w:spacing w:after="60" w:line="240"/>
+        <w:ind w:left="720" w:hanging="720"/>
+      </w:pPr>
+      <w:r>
+        <w:rPr>
+          <w:sz w:val="20"/>
+          <w:szCs w:val="20"/>
+        </w:rPr>
+        <w:t xml:space="preserve">Louis S, Gerstein GL, Grün S, Diesmann M (2010) Surrogate spike train generation through dithering in operational time. Front Comput Neurosci 4:127.</w:t>
+      </w:r>
+    </w:p>
+    <w:p>
+      <w:pPr>
+        <w:spacing w:after="60" w:line="240"/>
+        <w:ind w:left="720" w:hanging="720"/>
+      </w:pPr>
+      <w:r>
+        <w:rPr>
+          <w:sz w:val="20"/>
+          <w:szCs w:val="20"/>
+        </w:rPr>
+        <w:t xml:space="preserve">Moore DG, Valentini G, Walker SI, Levin M (2018) Inform: efficient information-theoretic analysis of collective behaviors. Front Robot AI 5:60.</w:t>
+      </w:r>
+    </w:p>
+    <w:p>
+      <w:pPr>
+        <w:spacing w:after="60" w:line="240"/>
+        <w:ind w:left="720" w:hanging="720"/>
+      </w:pPr>
+      <w:r>
+        <w:rPr>
+          <w:sz w:val="20"/>
+          <w:szCs w:val="20"/>
+        </w:rPr>
+        <w:t xml:space="preserve">Morrison SF, Nakamura K (2011) Central neural pathways for thermoregulation. Front Biosci 16:74–104.</w:t>
+      </w:r>
+    </w:p>
+    <w:p>
+      <w:pPr>
+        <w:spacing w:after="60" w:line="240"/>
+        <w:ind w:left="720" w:hanging="720"/>
+      </w:pPr>
+      <w:r>
+        <w:rPr>
+          <w:sz w:val="20"/>
+          <w:szCs w:val="20"/>
+        </w:rPr>
+        <w:t xml:space="preserve">Oh SW et al. (2014) A mesoscale connectome of the mouse brain. Nature 508:207–214.</w:t>
+      </w:r>
+    </w:p>
+    <w:p>
+      <w:pPr>
+        <w:spacing w:after="60" w:line="240"/>
+        <w:ind w:left="720" w:hanging="720"/>
+      </w:pPr>
+      <w:r>
+        <w:rPr>
+          <w:sz w:val="20"/>
+          <w:szCs w:val="20"/>
+        </w:rPr>
+        <w:t xml:space="preserve">Pachitariu M, Steinmetz N, Kadir S, Carandini M, Harris KD (2016) Kilosort: realtime spike-sorting for extracellular electrophysiology. bioRxiv doi:10.1101/061481.</w:t>
+      </w:r>
+    </w:p>
+    <w:p>
+      <w:pPr>
+        <w:spacing w:after="60" w:line="240"/>
+        <w:ind w:left="720" w:hanging="720"/>
+      </w:pPr>
+      <w:r>
+        <w:rPr>
+          <w:sz w:val="20"/>
+          <w:szCs w:val="20"/>
+        </w:rPr>
+        <w:t xml:space="preserve">Perin R, Berger TK, Markram H (2011) A synaptic organizing principle for cortical neuronal groups. Proc Natl Acad Sci USA 108:5419–5424.</w:t>
+      </w:r>
+    </w:p>
+    <w:p>
+      <w:pPr>
+        <w:spacing w:after="60" w:line="240"/>
+        <w:ind w:left="720" w:hanging="720"/>
+      </w:pPr>
+      <w:r>
+        <w:rPr>
+          <w:sz w:val="20"/>
+          <w:szCs w:val="20"/>
+        </w:rPr>
+        <w:t xml:space="preserve">Pillow JW, Shlens J, Paninski L, Sher A, Litke AM, Chichilnisky EJ, Simoncelli EP (2008) Spatio-temporal correlations and visual signalling in a complete neuronal population. Nature 454:995–999.</w:t>
+      </w:r>
+    </w:p>
+    <w:p>
+      <w:pPr>
+        <w:spacing w:after="60" w:line="240"/>
+        <w:ind w:left="720" w:hanging="720"/>
+      </w:pPr>
+      <w:r>
+        <w:rPr>
+          <w:sz w:val="20"/>
+          <w:szCs w:val="20"/>
+        </w:rPr>
+        <w:t xml:space="preserve">Quian Quiroga R, Panzeri S (2009) Extracting information from neuronal populations: information theory and decoding approaches. Nat Rev Neurosci 10:173–185.</w:t>
+      </w:r>
+    </w:p>
+    <w:p>
+      <w:pPr>
+        <w:spacing w:after="60" w:line="240"/>
+        <w:ind w:left="720" w:hanging="720"/>
+      </w:pPr>
+      <w:r>
+        <w:rPr>
+          <w:sz w:val="20"/>
+          <w:szCs w:val="20"/>
+        </w:rPr>
+        <w:t xml:space="preserve">Saper CB, Lowell BB (2014) The hypothalamus. Curr Biol 24:R1111–R1116.</w:t>
+      </w:r>
+    </w:p>
+    <w:p>
+      <w:pPr>
+        <w:spacing w:after="60" w:line="240"/>
+        <w:ind w:left="720" w:hanging="720"/>
+      </w:pPr>
+      <w:r>
+        <w:rPr>
+          <w:sz w:val="20"/>
+          <w:szCs w:val="20"/>
+        </w:rPr>
+        <w:t xml:space="preserve">Schreiber T (2000) Measuring information transfer. Phys Rev Lett 85:461–464.</w:t>
+      </w:r>
+    </w:p>
+    <w:p>
+      <w:pPr>
+        <w:spacing w:after="60" w:line="240"/>
+        <w:ind w:left="720" w:hanging="720"/>
+      </w:pPr>
+      <w:r>
+        <w:rPr>
+          <w:sz w:val="20"/>
+          <w:szCs w:val="20"/>
+        </w:rPr>
+        <w:t xml:space="preserve">Song S, Sjöström PJ, Reigl M, Nelson S, Chklovskii DB (2005) Highly nonrandom features of synaptic connectivity in local cortical circuits. PLoS Biol 3:e68.</w:t>
+      </w:r>
+    </w:p>
+    <w:p>
+      <w:pPr>
+        <w:spacing w:after="60" w:line="240"/>
+        <w:ind w:left="720" w:hanging="720"/>
+      </w:pPr>
+      <w:r>
+        <w:rPr>
+          <w:sz w:val="20"/>
+          <w:szCs w:val="20"/>
+        </w:rPr>
+        <w:t xml:space="preserve">Sternson SM (2013) Hypothalamic survival circuits: blueprints for purposive behaviors. Neuron 77:810–824.</w:t>
+      </w:r>
+    </w:p>
+    <w:p>
+      <w:pPr>
+        <w:spacing w:after="60" w:line="240"/>
+        <w:ind w:left="720" w:hanging="720"/>
+      </w:pPr>
+      <w:r>
+        <w:rPr>
+          <w:sz w:val="20"/>
+          <w:szCs w:val="20"/>
+        </w:rPr>
+        <w:t xml:space="preserve">Swanson LW (2000) Cerebral hemisphere regulation of motivated behavior. Brain Res 886:113–164.</w:t>
+      </w:r>
+    </w:p>
+    <w:p>
+      <w:pPr>
+        <w:spacing w:after="60" w:line="240"/>
+        <w:ind w:left="720" w:hanging="720"/>
+      </w:pPr>
+      <w:r>
+        <w:rPr>
+          <w:sz w:val="20"/>
+          <w:szCs w:val="20"/>
+        </w:rPr>
+        <w:t xml:space="preserve">Telesford QK, Joyce KE, Hayasaka S, Burdette JH, Laurienti PJ (2011) The ubiquity of small-world networks. Brain Connect 1:367–375.</w:t>
+      </w:r>
+    </w:p>
+    <w:p>
+      <w:pPr>
+        <w:spacing w:after="60" w:line="240"/>
+        <w:ind w:left="720" w:hanging="720"/>
+      </w:pPr>
+      <w:r>
+        <w:rPr>
+          <w:sz w:val="20"/>
+          <w:szCs w:val="20"/>
+        </w:rPr>
+        <w:t xml:space="preserve">Thompson RH, Swanson LW (2003) Structural characterization of a hypothalamic visceromotor pattern generator network. Brain Res Rev 41:153–202.</w:t>
+      </w:r>
+    </w:p>
+    <w:p>
+      <w:pPr>
+        <w:spacing w:after="60" w:line="240"/>
+        <w:ind w:left="720" w:hanging="720"/>
+      </w:pPr>
+      <w:r>
+        <w:rPr>
+          <w:sz w:val="20"/>
+          <w:szCs w:val="20"/>
+        </w:rPr>
+        <w:t xml:space="preserve">van den Heuvel MP, Sporns O (2011) Rich-club organization of the human connectome. J Neurosci 31:15775–15786.</w:t>
+      </w:r>
+    </w:p>
+    <w:p>
+      <w:pPr>
+        <w:spacing w:after="60" w:line="240"/>
+        <w:ind w:left="720" w:hanging="720"/>
+      </w:pPr>
+      <w:r>
+        <w:rPr>
+          <w:sz w:val="20"/>
+          <w:szCs w:val="20"/>
+        </w:rPr>
+        <w:t xml:space="preserve">van den Heuvel MP, Sporns O (2013) Network hubs in the human brain. Trends Cogn Sci 17:683–696.</w:t>
+      </w:r>
+    </w:p>
+    <w:p>
+      <w:pPr>
+        <w:spacing w:after="60" w:line="240"/>
+        <w:ind w:left="720" w:hanging="720"/>
+      </w:pPr>
+      <w:r>
+        <w:rPr>
+          <w:sz w:val="20"/>
+          <w:szCs w:val="20"/>
+        </w:rPr>
+        <w:t xml:space="preserve">Vicente R, Wibral M, Lindner M, Pipa G (2011) Transfer entropy—a model-free measure of effective connectivity for the neurosciences. J Comput Neurosci 30:45–67.</w:t>
+      </w:r>
+    </w:p>
+    <w:p>
+      <w:pPr>
+        <w:spacing w:after="60" w:line="240"/>
+        <w:ind w:left="720" w:hanging="720"/>
+      </w:pPr>
+      <w:r>
+        <w:rPr>
+          <w:sz w:val="20"/>
+          <w:szCs w:val="20"/>
+        </w:rPr>
+        <w:t xml:space="preserve">Watts DJ, Strogatz SH (1998) Collective dynamics of ‘small-world’ networks. Nature 393:440–442.</w:t>
+      </w:r>
+    </w:p>
+    <w:p>
+      <w:r>
+        <w:br w:type="page"/>
+      </w:r>
+    </w:p>
+    <w:p>
+      <w:pPr>
+        <w:pStyle w:val="Heading1"/>
+        <w:spacing w:after="200" w:before="360"/>
+      </w:pPr>
+      <w:r>
+        <w:rPr>
+          <w:b/>
+          <w:bCs/>
+          <w:sz w:val="28"/>
+          <w:szCs w:val="28"/>
+        </w:rPr>
+        <w:t xml:space="preserve">Figure Legends</w:t>
+      </w:r>
+    </w:p>
+    <w:p>
+      <w:pPr>
+        <w:spacing w:after="120" w:line="276"/>
+        <w:jc w:val="both"/>
+      </w:pPr>
+      <w:r>
+        <w:rPr>
+          <w:b w:val="false"/>
+          <w:bCs w:val="false"/>
+          <w:sz w:val="22"/>
+          <w:szCs w:val="22"/>
+        </w:rPr>
+        <w:t xml:space="preserve">Figure 1. Neuron yield and recording coverage. Per-animal neuron yield heatmap across nine hypothalamic regions, split by day (n = 6) and night (n = 7) recording phases. Numbers indicate neuron count per region. Color intensity represents recording density.</w:t>
+      </w:r>
+    </w:p>
+    <w:p>
+      <w:pPr>
+        <w:spacing w:after="120" w:line="276"/>
+        <w:jc w:val="both"/>
+      </w:pPr>
+      <w:r>
+        <w:rPr>
+          <w:b w:val="false"/>
+          <w:bCs w:val="false"/>
+          <w:sz w:val="22"/>
+          <w:szCs w:val="22"/>
+        </w:rPr>
+        <w:t xml:space="preserve">Figure 2. Condition × region interaction estimates from linear mixed-effects models. Forest plot showing interaction terms (conditionLightON:region) for four graph metrics: node strength, clustering coefficient, local efficiency, and hub score. Positive estimates (blue) indicate metric increase under light-ON relative to ongoing baseline in VM-thalamus; negative estimates (red) indicate decrease. Error bars: 95% confidence intervals. Significance: * p &lt; 0.05, ** p &lt; 0.01, *** p &lt; 0.001. Panel titles include overall interaction ANOVA p-values.</w:t>
+      </w:r>
+    </w:p>
+    <w:p>
+      <w:pPr>
+        <w:spacing w:after="120" w:line="276"/>
+        <w:jc w:val="both"/>
+      </w:pPr>
+      <w:r>
+        <w:rPr>
+          <w:b w:val="false"/>
+          <w:bCs w:val="false"/>
+          <w:sz w:val="22"/>
+          <w:szCs w:val="22"/>
+        </w:rPr>
+        <w:t xml:space="preserve">Figure 3. Region-level connectivity density. Mean connection density between hypothalamic region pairs during light-ON stimulation, shown separately for day (left) and night (right) animals. Density is normalized by the number of possible neuron pairs between regions, correcting for unequal neuron sampling. Color scale: white (low density) to red (high density). Only edges surviving BH-FDR validation (q = 0.05) are included.</w:t>
+      </w:r>
+    </w:p>
+    <w:p>
+      <w:pPr>
+        <w:spacing w:after="120" w:line="276"/>
+        <w:jc w:val="both"/>
+      </w:pPr>
+      <w:r>
+        <w:rPr>
+          <w:b w:val="false"/>
+          <w:bCs w:val="false"/>
+          <w:sz w:val="22"/>
+          <w:szCs w:val="22"/>
+        </w:rPr>
+        <w:t xml:space="preserve">Figure 4. Hub score stability across the ongoing-to-light transition. Per-animal Spearman rank correlation (ρ) of hub scores between the ongoing and light-ON conditions. Group-level Wilcoxon signed-rank test (V = 6, p = 0.92) and BCa bootstrap 95% confidence interval [−0.20, 0.09] indicate no significant hub reorganization by photic stimulation.</w:t>
       </w:r>
     </w:p>
     <w:sectPr>

</xml_diff>